<commit_message>
docs(insermed): agrega flujo de cirugías (solicitud, armado de cajas, regreso de inventario, liquidación)
Co-Authored-By: Claude Opus 4.8 <noreply@anthropic.com>
</commit_message>
<xml_diff>
--- a/docs/Manual_Flujo_Insermed.docx
+++ b/docs/Manual_Flujo_Insermed.docx
@@ -203,6 +203,31 @@
               <w:rPr>
                 <w:b/>
               </w:rPr>
+              <w:t>Cirugías</w:t>
+            </w:r>
+          </w:p>
+        </w:tc>
+        <w:tc>
+          <w:tcPr>
+            <w:tcW w:type="dxa" w:w="4320"/>
+          </w:tcPr>
+          <w:p>
+            <w:r>
+              <w:t>Solicitud → Surtir cajas → Regreso de inventario → Finalizar → Liquidar (pedido)</w:t>
+            </w:r>
+          </w:p>
+        </w:tc>
+      </w:tr>
+      <w:tr>
+        <w:tc>
+          <w:tcPr>
+            <w:tcW w:type="dxa" w:w="4320"/>
+          </w:tcPr>
+          <w:p>
+            <w:r>
+              <w:rPr>
+                <w:b/>
+              </w:rPr>
               <w:t>Finanzas</w:t>
             </w:r>
           </w:p>
@@ -1159,11 +1184,854 @@
       </w:r>
     </w:p>
     <w:p>
+      <w:r>
+        <w:br w:type="page"/>
+      </w:r>
+    </w:p>
+    <w:p>
       <w:pPr>
         <w:pStyle w:val="Heading1"/>
       </w:pPr>
       <w:r>
-        <w:t>6. Finanzas (cobro y facturación)</w:t>
+        <w:t>6. Flujo de cirugías (Insermed)</w:t>
+      </w:r>
+    </w:p>
+    <w:p>
+      <w:pPr>
+        <w:spacing w:after="120"/>
+      </w:pPr>
+      <w:r>
+        <w:rPr>
+          <w:b w:val="0"/>
+          <w:i w:val="0"/>
+          <w:sz w:val="22"/>
+        </w:rPr>
+        <w:t>Este es el flujo central de Insermed: se envía material (cajas/kits) a un hospital para una cirugía, regresa lo que no se usó, y solo se le cobra al cliente el consumo real (consumibles usados) más la renta del instrumental retornable. El sistema descuenta y regresa inventario automáticamente en cada paso y, al final, genera el pedido y la cuenta por cobrar.</w:t>
+      </w:r>
+    </w:p>
+    <w:p>
+      <w:pPr>
+        <w:pStyle w:val="Heading2"/>
+      </w:pPr>
+      <w:r>
+        <w:t>Estados de una solicitud de cirugía</w:t>
+      </w:r>
+    </w:p>
+    <w:tbl>
+      <w:tblPr>
+        <w:tblStyle w:val="TableGrid"/>
+        <w:tblW w:type="auto" w:w="0"/>
+        <w:jc w:val="center"/>
+        <w:tblLook w:firstColumn="1" w:firstRow="1" w:lastColumn="0" w:lastRow="0" w:noHBand="0" w:noVBand="1" w:val="04A0"/>
+      </w:tblPr>
+      <w:tblGrid>
+        <w:gridCol w:w="4320"/>
+        <w:gridCol w:w="4320"/>
+      </w:tblGrid>
+      <w:tr>
+        <w:tc>
+          <w:tcPr>
+            <w:tcW w:type="dxa" w:w="4320"/>
+            <w:shd w:val="clear" w:fill="D5E3F0"/>
+          </w:tcPr>
+          <w:p>
+            <w:r>
+              <w:rPr>
+                <w:b/>
+              </w:rPr>
+              <w:t>Estado</w:t>
+            </w:r>
+          </w:p>
+        </w:tc>
+        <w:tc>
+          <w:tcPr>
+            <w:tcW w:type="dxa" w:w="4320"/>
+            <w:shd w:val="clear" w:fill="D5E3F0"/>
+          </w:tcPr>
+          <w:p>
+            <w:r>
+              <w:rPr>
+                <w:b/>
+              </w:rPr>
+              <w:t>Significado</w:t>
+            </w:r>
+          </w:p>
+        </w:tc>
+      </w:tr>
+      <w:tr>
+        <w:tc>
+          <w:tcPr>
+            <w:tcW w:type="dxa" w:w="4320"/>
+          </w:tcPr>
+          <w:p>
+            <w:r>
+              <w:rPr>
+                <w:b/>
+              </w:rPr>
+              <w:t>Solicitada</w:t>
+            </w:r>
+          </w:p>
+        </w:tc>
+        <w:tc>
+          <w:tcPr>
+            <w:tcW w:type="dxa" w:w="4320"/>
+          </w:tcPr>
+          <w:p>
+            <w:r>
+              <w:t>Se capturó la cirugía, aún no sale material.</w:t>
+            </w:r>
+          </w:p>
+        </w:tc>
+      </w:tr>
+      <w:tr>
+        <w:tc>
+          <w:tcPr>
+            <w:tcW w:type="dxa" w:w="4320"/>
+          </w:tcPr>
+          <w:p>
+            <w:r>
+              <w:rPr>
+                <w:b/>
+              </w:rPr>
+              <w:t>Surtida</w:t>
+            </w:r>
+          </w:p>
+        </w:tc>
+        <w:tc>
+          <w:tcPr>
+            <w:tcW w:type="dxa" w:w="4320"/>
+          </w:tcPr>
+          <w:p>
+            <w:r>
+              <w:t>Ya se enviaron una o más cajas al hospital.</w:t>
+            </w:r>
+          </w:p>
+        </w:tc>
+      </w:tr>
+      <w:tr>
+        <w:tc>
+          <w:tcPr>
+            <w:tcW w:type="dxa" w:w="4320"/>
+          </w:tcPr>
+          <w:p>
+            <w:r>
+              <w:rPr>
+                <w:b/>
+              </w:rPr>
+              <w:t>Por facturar</w:t>
+            </w:r>
+          </w:p>
+        </w:tc>
+        <w:tc>
+          <w:tcPr>
+            <w:tcW w:type="dxa" w:w="4320"/>
+          </w:tcPr>
+          <w:p>
+            <w:r>
+              <w:t>Regresó el material y almacén finalizó; falta generar el pedido.</w:t>
+            </w:r>
+          </w:p>
+        </w:tc>
+      </w:tr>
+      <w:tr>
+        <w:tc>
+          <w:tcPr>
+            <w:tcW w:type="dxa" w:w="4320"/>
+          </w:tcPr>
+          <w:p>
+            <w:r>
+              <w:rPr>
+                <w:b/>
+              </w:rPr>
+              <w:t>Liquidada</w:t>
+            </w:r>
+          </w:p>
+        </w:tc>
+        <w:tc>
+          <w:tcPr>
+            <w:tcW w:type="dxa" w:w="4320"/>
+          </w:tcPr>
+          <w:p>
+            <w:r>
+              <w:t>Ventas generó el pedido y la cuenta por cobrar.</w:t>
+            </w:r>
+          </w:p>
+        </w:tc>
+      </w:tr>
+      <w:tr>
+        <w:tc>
+          <w:tcPr>
+            <w:tcW w:type="dxa" w:w="4320"/>
+          </w:tcPr>
+          <w:p>
+            <w:r>
+              <w:rPr>
+                <w:b/>
+              </w:rPr>
+              <w:t>Cancelada</w:t>
+            </w:r>
+          </w:p>
+        </w:tc>
+        <w:tc>
+          <w:tcPr>
+            <w:tcW w:type="dxa" w:w="4320"/>
+          </w:tcPr>
+          <w:p>
+            <w:r>
+              <w:t>Solicitud anulada (solo antes de surtir).</w:t>
+            </w:r>
+          </w:p>
+        </w:tc>
+      </w:tr>
+    </w:tbl>
+    <w:p>
+      <w:pPr>
+        <w:spacing w:after="120"/>
+      </w:pPr>
+      <w:r>
+        <w:rPr>
+          <w:b w:val="0"/>
+          <w:i w:val="0"/>
+          <w:sz w:val="22"/>
+        </w:rPr>
+      </w:r>
+    </w:p>
+    <w:p>
+      <w:pPr>
+        <w:pStyle w:val="Heading2"/>
+      </w:pPr>
+      <w:r>
+        <w:t>6.1 Catálogos previos (una sola vez)</w:t>
+      </w:r>
+    </w:p>
+    <w:p>
+      <w:pPr>
+        <w:spacing w:after="120"/>
+      </w:pPr>
+      <w:r>
+        <w:rPr>
+          <w:b w:val="0"/>
+          <w:i w:val="0"/>
+          <w:sz w:val="22"/>
+        </w:rPr>
+        <w:t>Antes de operar cirugías deben existir estos catálogos en el módulo de Cirugías e Inventarios:</w:t>
+      </w:r>
+    </w:p>
+    <w:p>
+      <w:pPr>
+        <w:pStyle w:val="ListBullet"/>
+        <w:spacing w:after="60"/>
+      </w:pPr>
+      <w:r>
+        <w:t>Doctores y Hospitales (Cirugías → Doctores / Hospitales). Se pueden cargar de forma masiva con la plantilla Excel.</w:t>
+      </w:r>
+    </w:p>
+    <w:p>
+      <w:pPr>
+        <w:pStyle w:val="ListBullet"/>
+        <w:spacing w:after="60"/>
+      </w:pPr>
+      <w:r>
+        <w:t>Productos marcados como retornables (instrumental que regresa) o consumibles (lo que se gasta y se cobra).</w:t>
+      </w:r>
+    </w:p>
+    <w:p>
+      <w:pPr>
+        <w:pStyle w:val="ListBullet"/>
+        <w:spacing w:after="60"/>
+      </w:pPr>
+      <w:r>
+        <w:t>Cajas / kits armados con su contenido (ver 6.2).</w:t>
+      </w:r>
+    </w:p>
+    <w:p>
+      <w:pPr>
+        <w:pStyle w:val="Heading2"/>
+      </w:pPr>
+      <w:r>
+        <w:t>6.2 Armado de cajas</w:t>
+      </w:r>
+    </w:p>
+    <w:p>
+      <w:pPr>
+        <w:spacing w:after="120"/>
+      </w:pPr>
+      <w:r>
+        <w:rPr>
+          <w:b w:val="0"/>
+          <w:i w:val="0"/>
+          <w:sz w:val="22"/>
+        </w:rPr>
+        <w:t>Una caja es un contenedor físico identificable que sale y regresa muchas veces. Puede basarse en una plantilla (Kit) o armarse libre.</w:t>
+      </w:r>
+    </w:p>
+    <w:p>
+      <w:pPr>
+        <w:spacing w:after="40"/>
+      </w:pPr>
+      <w:r>
+        <w:rPr>
+          <w:b/>
+          <w:color w:val="1F4E79"/>
+        </w:rPr>
+        <w:t xml:space="preserve">Paso 1. </w:t>
+      </w:r>
+      <w:r>
+        <w:rPr>
+          <w:b/>
+        </w:rPr>
+        <w:t>Definir la receta de la caja</w:t>
+      </w:r>
+    </w:p>
+    <w:p>
+      <w:pPr>
+        <w:spacing w:after="160"/>
+        <w:ind w:left="504"/>
+      </w:pPr>
+      <w:r>
+        <w:rPr>
+          <w:sz w:val="21"/>
+        </w:rPr>
+        <w:t>Indica qué productos debe contener y, por cada uno, si es retornable (herramienta/renta que regresa) o consumible (se gasta y se cobra).</w:t>
+      </w:r>
+    </w:p>
+    <w:p>
+      <w:pPr>
+        <w:spacing w:after="40"/>
+      </w:pPr>
+      <w:r>
+        <w:rPr>
+          <w:b/>
+          <w:color w:val="1F4E79"/>
+        </w:rPr>
+        <w:t xml:space="preserve">Paso 2. </w:t>
+      </w:r>
+      <w:r>
+        <w:rPr>
+          <w:b/>
+        </w:rPr>
+        <w:t>Cargar el material a la caja</w:t>
+      </w:r>
+    </w:p>
+    <w:p>
+      <w:pPr>
+        <w:spacing w:after="160"/>
+        <w:ind w:left="504"/>
+      </w:pPr>
+      <w:r>
+        <w:rPr>
+          <w:sz w:val="21"/>
+        </w:rPr>
+        <w:t>Se surte físicamente el contenido; el stock queda dentro de la ubicación de la caja. La caja pasa a estado 'Disponible'.</w:t>
+      </w:r>
+    </w:p>
+    <w:p>
+      <w:pPr>
+        <w:spacing w:after="160"/>
+        <w:ind w:left="288"/>
+      </w:pPr>
+      <w:r>
+        <w:rPr>
+          <w:b/>
+          <w:color w:val="B06A00"/>
+        </w:rPr>
+        <w:t xml:space="preserve">Nota: </w:t>
+      </w:r>
+      <w:r>
+        <w:rPr>
+          <w:i/>
+          <w:sz w:val="21"/>
+        </w:rPr>
+        <w:t>Las cajas pueden ser propias o de consignación (de un tercero/consignante). Una salida lleva stock todo propio o todo a consignación, sin mezclar.</w:t>
+      </w:r>
+    </w:p>
+    <w:p>
+      <w:pPr>
+        <w:pStyle w:val="Heading2"/>
+      </w:pPr>
+      <w:r>
+        <w:t>6.3 Solicitud de cirugía</w:t>
+      </w:r>
+    </w:p>
+    <w:p>
+      <w:pPr>
+        <w:spacing w:after="40"/>
+      </w:pPr>
+      <w:r>
+        <w:rPr>
+          <w:b/>
+          <w:color w:val="1F4E79"/>
+        </w:rPr>
+        <w:t xml:space="preserve">Paso 1. </w:t>
+      </w:r>
+      <w:r>
+        <w:rPr>
+          <w:b/>
+        </w:rPr>
+        <w:t>Nueva solicitud</w:t>
+      </w:r>
+    </w:p>
+    <w:p>
+      <w:pPr>
+        <w:spacing w:after="160"/>
+        <w:ind w:left="504"/>
+      </w:pPr>
+      <w:r>
+        <w:rPr>
+          <w:sz w:val="21"/>
+        </w:rPr>
+        <w:t>Cirugías → Solicitudes → Nueva. Captura paciente (referencia, sin datos sensibles), doctor, hospital y fecha de cirugía.</w:t>
+      </w:r>
+    </w:p>
+    <w:p>
+      <w:pPr>
+        <w:spacing w:after="40"/>
+      </w:pPr>
+      <w:r>
+        <w:rPr>
+          <w:b/>
+          <w:color w:val="1F4E79"/>
+        </w:rPr>
+        <w:t xml:space="preserve">Paso 2. </w:t>
+      </w:r>
+      <w:r>
+        <w:rPr>
+          <w:b/>
+        </w:rPr>
+        <w:t>Indicar el cliente a facturar</w:t>
+      </w:r>
+    </w:p>
+    <w:p>
+      <w:pPr>
+        <w:spacing w:after="160"/>
+        <w:ind w:left="504"/>
+      </w:pPr>
+      <w:r>
+        <w:rPr>
+          <w:sz w:val="21"/>
+        </w:rPr>
+        <w:t>Selecciona el cliente al que se le liquidará la cirugía. La solicitud queda en estado 'Solicitada'.</w:t>
+      </w:r>
+    </w:p>
+    <w:p>
+      <w:pPr>
+        <w:pStyle w:val="Heading2"/>
+      </w:pPr>
+      <w:r>
+        <w:t>6.4 Surtir (enviar la caja a la cirugía)</w:t>
+      </w:r>
+    </w:p>
+    <w:p>
+      <w:pPr>
+        <w:spacing w:after="40"/>
+      </w:pPr>
+      <w:r>
+        <w:rPr>
+          <w:b/>
+          <w:color w:val="1F4E79"/>
+        </w:rPr>
+        <w:t xml:space="preserve">Paso 1. </w:t>
+      </w:r>
+      <w:r>
+        <w:rPr>
+          <w:b/>
+        </w:rPr>
+        <w:t>Elegir la caja disponible</w:t>
+      </w:r>
+    </w:p>
+    <w:p>
+      <w:pPr>
+        <w:spacing w:after="160"/>
+        <w:ind w:left="504"/>
+      </w:pPr>
+      <w:r>
+        <w:rPr>
+          <w:sz w:val="21"/>
+        </w:rPr>
+        <w:t>Desde el detalle de la solicitud, selecciona una caja disponible de la sucursal y da 'Surtir'.</w:t>
+      </w:r>
+    </w:p>
+    <w:p>
+      <w:pPr>
+        <w:spacing w:after="40"/>
+      </w:pPr>
+      <w:r>
+        <w:rPr>
+          <w:b/>
+          <w:color w:val="1F4E79"/>
+        </w:rPr>
+        <w:t xml:space="preserve">Paso 2. </w:t>
+      </w:r>
+      <w:r>
+        <w:rPr>
+          <w:b/>
+        </w:rPr>
+        <w:t>Salida automática</w:t>
+      </w:r>
+    </w:p>
+    <w:p>
+      <w:pPr>
+        <w:spacing w:after="160"/>
+        <w:ind w:left="504"/>
+      </w:pPr>
+      <w:r>
+        <w:rPr>
+          <w:sz w:val="21"/>
+        </w:rPr>
+        <w:t>La caja sale con TODO su contenido actual; el sistema descuenta ese stock del inventario y registra la salida con trazabilidad (lote/serie). Puedes enviar varias cajas a la misma cirugía.</w:t>
+      </w:r>
+    </w:p>
+    <w:p>
+      <w:pPr>
+        <w:spacing w:after="160"/>
+      </w:pPr>
+      <w:r>
+        <w:rPr>
+          <w:b w:val="0"/>
+          <w:i w:val="0"/>
+          <w:sz w:val="22"/>
+        </w:rPr>
+        <w:t>La solicitud pasa a 'Surtida' y la caja queda 'En campo (hospital)'.</w:t>
+      </w:r>
+    </w:p>
+    <w:p>
+      <w:pPr>
+        <w:pStyle w:val="Heading2"/>
+      </w:pPr>
+      <w:r>
+        <w:t>6.5 Regreso de inventario</w:t>
+      </w:r>
+    </w:p>
+    <w:p>
+      <w:pPr>
+        <w:spacing w:after="120"/>
+      </w:pPr>
+      <w:r>
+        <w:rPr>
+          <w:b w:val="0"/>
+          <w:i w:val="0"/>
+          <w:sz w:val="22"/>
+        </w:rPr>
+        <w:t>Cuando la caja vuelve del hospital, se captura qué regresó. El consumo se calcula solo: consumo = enviado − regresado.</w:t>
+      </w:r>
+    </w:p>
+    <w:p>
+      <w:pPr>
+        <w:spacing w:after="40"/>
+      </w:pPr>
+      <w:r>
+        <w:rPr>
+          <w:b/>
+          <w:color w:val="1F4E79"/>
+        </w:rPr>
+        <w:t xml:space="preserve">Paso 1. </w:t>
+      </w:r>
+      <w:r>
+        <w:rPr>
+          <w:b/>
+        </w:rPr>
+        <w:t>Abrir el regreso de la caja</w:t>
+      </w:r>
+    </w:p>
+    <w:p>
+      <w:pPr>
+        <w:spacing w:after="160"/>
+        <w:ind w:left="504"/>
+      </w:pPr>
+      <w:r>
+        <w:rPr>
+          <w:sz w:val="21"/>
+        </w:rPr>
+        <w:t>En el detalle de la solicitud, entra a 'Regreso' de la caja correspondiente.</w:t>
+      </w:r>
+    </w:p>
+    <w:p>
+      <w:pPr>
+        <w:spacing w:after="40"/>
+      </w:pPr>
+      <w:r>
+        <w:rPr>
+          <w:b/>
+          <w:color w:val="1F4E79"/>
+        </w:rPr>
+        <w:t xml:space="preserve">Paso 2. </w:t>
+      </w:r>
+      <w:r>
+        <w:rPr>
+          <w:b/>
+        </w:rPr>
+        <w:t>Capturar lo retornado por producto</w:t>
+      </w:r>
+    </w:p>
+    <w:p>
+      <w:pPr>
+        <w:spacing w:after="160"/>
+        <w:ind w:left="504"/>
+      </w:pPr>
+      <w:r>
+        <w:rPr>
+          <w:sz w:val="21"/>
+        </w:rPr>
+        <w:t>Por cada renglón, anota cuánto regresó. Lo retornado vuelve al inventario a su ubicación de origen; lo no retornado queda como consumo.</w:t>
+      </w:r>
+    </w:p>
+    <w:p>
+      <w:pPr>
+        <w:spacing w:after="40"/>
+      </w:pPr>
+      <w:r>
+        <w:rPr>
+          <w:b/>
+          <w:color w:val="1F4E79"/>
+        </w:rPr>
+        <w:t xml:space="preserve">Paso 3. </w:t>
+      </w:r>
+      <w:r>
+        <w:rPr>
+          <w:b/>
+        </w:rPr>
+        <w:t>Marcar lo cobrable</w:t>
+      </w:r>
+    </w:p>
+    <w:p>
+      <w:pPr>
+        <w:spacing w:after="160"/>
+        <w:ind w:left="504"/>
+      </w:pPr>
+      <w:r>
+        <w:rPr>
+          <w:sz w:val="21"/>
+        </w:rPr>
+        <w:t>Indica qué consumo se le cobra al cliente. El instrumental retornable que regresó no se cobra (solo se cobra su renta).</w:t>
+      </w:r>
+    </w:p>
+    <w:p>
+      <w:pPr>
+        <w:spacing w:after="40"/>
+      </w:pPr>
+      <w:r>
+        <w:rPr>
+          <w:b/>
+          <w:color w:val="1F4E79"/>
+        </w:rPr>
+        <w:t xml:space="preserve">Paso 4. </w:t>
+      </w:r>
+      <w:r>
+        <w:rPr>
+          <w:b/>
+        </w:rPr>
+        <w:t>Guardar</w:t>
+      </w:r>
+    </w:p>
+    <w:p>
+      <w:pPr>
+        <w:spacing w:after="160"/>
+        <w:ind w:left="504"/>
+      </w:pPr>
+      <w:r>
+        <w:rPr>
+          <w:sz w:val="21"/>
+        </w:rPr>
+        <w:t>La caja queda 'Retornada' y el consumo listo para liquidar.</w:t>
+      </w:r>
+    </w:p>
+    <w:p>
+      <w:pPr>
+        <w:spacing w:after="160"/>
+        <w:ind w:left="288"/>
+      </w:pPr>
+      <w:r>
+        <w:rPr>
+          <w:b/>
+          <w:color w:val="B06A00"/>
+        </w:rPr>
+        <w:t xml:space="preserve">Nota: </w:t>
+      </w:r>
+      <w:r>
+        <w:rPr>
+          <w:i/>
+          <w:sz w:val="21"/>
+        </w:rPr>
+        <w:t>Hasta no registrar el regreso de cada caja, la cirugía no se puede finalizar ni facturar.</w:t>
+      </w:r>
+    </w:p>
+    <w:p>
+      <w:pPr>
+        <w:pStyle w:val="Heading2"/>
+      </w:pPr>
+      <w:r>
+        <w:t>6.6 Finalizar (almacén)</w:t>
+      </w:r>
+    </w:p>
+    <w:p>
+      <w:pPr>
+        <w:spacing w:after="40"/>
+      </w:pPr>
+      <w:r>
+        <w:rPr>
+          <w:b/>
+          <w:color w:val="1F4E79"/>
+        </w:rPr>
+        <w:t xml:space="preserve">Paso 1. </w:t>
+      </w:r>
+      <w:r>
+        <w:rPr>
+          <w:b/>
+        </w:rPr>
+        <w:t>Confirmar y finalizar</w:t>
+      </w:r>
+    </w:p>
+    <w:p>
+      <w:pPr>
+        <w:spacing w:after="160"/>
+        <w:ind w:left="504"/>
+      </w:pPr>
+      <w:r>
+        <w:rPr>
+          <w:sz w:val="21"/>
+        </w:rPr>
+        <w:t>Almacén revisa el consumo (puede corregir la referencia del paciente) y da 'Finalizar'.</w:t>
+      </w:r>
+    </w:p>
+    <w:p>
+      <w:pPr>
+        <w:spacing w:after="40"/>
+      </w:pPr>
+      <w:r>
+        <w:rPr>
+          <w:b/>
+          <w:color w:val="1F4E79"/>
+        </w:rPr>
+        <w:t xml:space="preserve">Paso 2. </w:t>
+      </w:r>
+      <w:r>
+        <w:rPr>
+          <w:b/>
+        </w:rPr>
+        <w:t>Liberación de cajas</w:t>
+      </w:r>
+    </w:p>
+    <w:p>
+      <w:pPr>
+        <w:spacing w:after="160"/>
+        <w:ind w:left="504"/>
+      </w:pPr>
+      <w:r>
+        <w:rPr>
+          <w:sz w:val="21"/>
+        </w:rPr>
+        <w:t>El sistema libera las cajas (vuelven a 'Disponible') y deja la cirugía en 'Por facturar'. Aquí NO se toca dinero todavía.</w:t>
+      </w:r>
+    </w:p>
+    <w:p>
+      <w:pPr>
+        <w:pStyle w:val="Heading2"/>
+      </w:pPr>
+      <w:r>
+        <w:t>6.7 Liquidar (ventas genera el pedido)</w:t>
+      </w:r>
+    </w:p>
+    <w:p>
+      <w:pPr>
+        <w:spacing w:after="40"/>
+      </w:pPr>
+      <w:r>
+        <w:rPr>
+          <w:b/>
+          <w:color w:val="1F4E79"/>
+        </w:rPr>
+        <w:t xml:space="preserve">Paso 1. </w:t>
+      </w:r>
+      <w:r>
+        <w:rPr>
+          <w:b/>
+        </w:rPr>
+        <w:t>Generar el pedido de la cirugía</w:t>
+      </w:r>
+    </w:p>
+    <w:p>
+      <w:pPr>
+        <w:spacing w:after="160"/>
+        <w:ind w:left="504"/>
+      </w:pPr>
+      <w:r>
+        <w:rPr>
+          <w:sz w:val="21"/>
+        </w:rPr>
+        <w:t>Ventas toma la cirugía 'Por facturar' y la liquida. Se crea un pedido (folio tipo SUC-CX-00001) ya marcado como entregado.</w:t>
+      </w:r>
+    </w:p>
+    <w:p>
+      <w:pPr>
+        <w:spacing w:after="40"/>
+      </w:pPr>
+      <w:r>
+        <w:rPr>
+          <w:b/>
+          <w:color w:val="1F4E79"/>
+        </w:rPr>
+        <w:t xml:space="preserve">Paso 2. </w:t>
+      </w:r>
+      <w:r>
+        <w:rPr>
+          <w:b/>
+        </w:rPr>
+        <w:t>Qué se factura</w:t>
+      </w:r>
+    </w:p>
+    <w:p>
+      <w:pPr>
+        <w:spacing w:after="160"/>
+        <w:ind w:left="504"/>
+      </w:pPr>
+      <w:r>
+        <w:rPr>
+          <w:sz w:val="21"/>
+        </w:rPr>
+        <w:t>El pedido incluye: renta de cada instrumental retornable + el consumo de los consumibles usados. Los extras y comisiones se agregan después en el pedido (los extras solo en Insermed).</w:t>
+      </w:r>
+    </w:p>
+    <w:p>
+      <w:pPr>
+        <w:spacing w:after="40"/>
+      </w:pPr>
+      <w:r>
+        <w:rPr>
+          <w:b/>
+          <w:color w:val="1F4E79"/>
+        </w:rPr>
+        <w:t xml:space="preserve">Paso 3. </w:t>
+      </w:r>
+      <w:r>
+        <w:rPr>
+          <w:b/>
+        </w:rPr>
+        <w:t>Cuenta por cobrar</w:t>
+      </w:r>
+    </w:p>
+    <w:p>
+      <w:pPr>
+        <w:spacing w:after="160"/>
+        <w:ind w:left="504"/>
+      </w:pPr>
+      <w:r>
+        <w:rPr>
+          <w:sz w:val="21"/>
+        </w:rPr>
+        <w:t>Se genera automáticamente la cuenta por cobrar y la cirugía queda 'Liquidada'. De aquí sigue el flujo normal de Finanzas (cobro y facturación, secciones 7 en adelante).</w:t>
+      </w:r>
+    </w:p>
+    <w:p>
+      <w:r>
+        <w:br w:type="page"/>
+      </w:r>
+    </w:p>
+    <w:p>
+      <w:pPr>
+        <w:pStyle w:val="Heading1"/>
+      </w:pPr>
+      <w:r>
+        <w:t>7. Finanzas (cobro y facturación)</w:t>
       </w:r>
     </w:p>
     <w:p>
@@ -1184,7 +2052,7 @@
         <w:pStyle w:val="Heading2"/>
       </w:pPr>
       <w:r>
-        <w:t>6.1 Cuentas por cobrar</w:t>
+        <w:t>7.1 Cuentas por cobrar</w:t>
       </w:r>
     </w:p>
     <w:p>
@@ -1254,7 +2122,7 @@
         <w:pStyle w:val="Heading2"/>
       </w:pPr>
       <w:r>
-        <w:t>6.2 Registrar un cobro (pago)</w:t>
+        <w:t>7.2 Registrar un cobro (pago)</w:t>
       </w:r>
     </w:p>
     <w:p>
@@ -1322,7 +2190,7 @@
         <w:pStyle w:val="Heading2"/>
       </w:pPr>
       <w:r>
-        <w:t>6.3 Generar el Excel para facturar</w:t>
+        <w:t>7.3 Generar el Excel para facturar</w:t>
       </w:r>
     </w:p>
     <w:p>
@@ -1433,7 +2301,7 @@
         <w:pStyle w:val="Heading2"/>
       </w:pPr>
       <w:r>
-        <w:t>6.4 Estados de cuenta por cliente</w:t>
+        <w:t>7.4 Estados de cuenta por cliente</w:t>
       </w:r>
     </w:p>
     <w:p>
@@ -1471,7 +2339,7 @@
         <w:pStyle w:val="Heading1"/>
       </w:pPr>
       <w:r>
-        <w:t>7. Tablero ejecutivo</w:t>
+        <w:t>8. Tablero ejecutivo</w:t>
       </w:r>
     </w:p>
     <w:p>
@@ -1492,7 +2360,20 @@
         <w:pStyle w:val="Heading1"/>
       </w:pPr>
       <w:r>
-        <w:t>8. Resumen del flujo de Insermed</w:t>
+        <w:t>9. Resumen del flujo de Insermed</w:t>
+      </w:r>
+    </w:p>
+    <w:p>
+      <w:pPr>
+        <w:spacing w:after="40"/>
+      </w:pPr>
+      <w:r>
+        <w:rPr>
+          <w:b/>
+          <w:i w:val="0"/>
+          <w:sz w:val="22"/>
+        </w:rPr>
+        <w:t>Ruta comercial estándar:</w:t>
       </w:r>
     </w:p>
     <w:p>
@@ -1565,6 +2446,85 @@
       </w:pPr>
       <w:r>
         <w:t>Reviso estados de cuenta y el tablero ejecutivo.</w:t>
+      </w:r>
+    </w:p>
+    <w:p>
+      <w:pPr>
+        <w:spacing w:after="120"/>
+      </w:pPr>
+      <w:r>
+        <w:rPr>
+          <w:b w:val="0"/>
+          <w:i w:val="0"/>
+          <w:sz w:val="22"/>
+        </w:rPr>
+      </w:r>
+    </w:p>
+    <w:p>
+      <w:pPr>
+        <w:spacing w:after="40"/>
+      </w:pPr>
+      <w:r>
+        <w:rPr>
+          <w:b/>
+          <w:i w:val="0"/>
+          <w:sz w:val="22"/>
+        </w:rPr>
+        <w:t>Ruta de cirugía (Insermed):</w:t>
+      </w:r>
+    </w:p>
+    <w:p>
+      <w:pPr>
+        <w:pStyle w:val="ListNumber"/>
+        <w:spacing w:after="80"/>
+      </w:pPr>
+      <w:r>
+        <w:t>Creo la solicitud de cirugía (paciente, doctor, hospital, cliente a facturar).</w:t>
+      </w:r>
+    </w:p>
+    <w:p>
+      <w:pPr>
+        <w:pStyle w:val="ListNumber"/>
+        <w:spacing w:after="80"/>
+      </w:pPr>
+      <w:r>
+        <w:t>Surto: envío la(s) caja(s) con su contenido → se descuenta inventario.</w:t>
+      </w:r>
+    </w:p>
+    <w:p>
+      <w:pPr>
+        <w:pStyle w:val="ListNumber"/>
+        <w:spacing w:after="80"/>
+      </w:pPr>
+      <w:r>
+        <w:t>Registro el regreso de cada caja: lo retornado vuelve al almacén, lo no retornado es consumo.</w:t>
+      </w:r>
+    </w:p>
+    <w:p>
+      <w:pPr>
+        <w:pStyle w:val="ListNumber"/>
+        <w:spacing w:after="80"/>
+      </w:pPr>
+      <w:r>
+        <w:t>Almacén finaliza → libera las cajas y deja la cirugía 'Por facturar'.</w:t>
+      </w:r>
+    </w:p>
+    <w:p>
+      <w:pPr>
+        <w:pStyle w:val="ListNumber"/>
+        <w:spacing w:after="80"/>
+      </w:pPr>
+      <w:r>
+        <w:t>Ventas liquida → genera el pedido (renta de retornables + consumibles usados) y la cuenta por cobrar.</w:t>
+      </w:r>
+    </w:p>
+    <w:p>
+      <w:pPr>
+        <w:pStyle w:val="ListNumber"/>
+        <w:spacing w:after="80"/>
+      </w:pPr>
+      <w:r>
+        <w:t>Sigo con el cobro y la facturación normales (sección 7).</w:t>
       </w:r>
     </w:p>
     <w:p>

</xml_diff>